<commit_message>
Italicize University of Kelaniya in the author affiliation block
Applied to both the LaTeX title block and the Word doc source, matching
the requested author-block style. Recompiled clean at 6 pages.

Co-Authored-By: Claude Sonnet 5 <noreply@anthropic.com>
</commit_message>
<xml_diff>
--- a/Final Paper/semantic_drift_paper.docx
+++ b/Final Paper/semantic_drift_paper.docx
@@ -32,6 +32,10 @@
         <w:t xml:space="preserve"> </w:t>
       </w:r>
       <w:r>
+        <w:rPr>
+          <w:i/>
+          <w:iCs/>
+        </w:rPr>
         <w:t xml:space="preserve">University of Kelaniya</w:t>
       </w:r>
       <w:r>

</xml_diff>